<commit_message>
Fill Week 3 paper-annotation worksheet from the CodeS paper
- All section blanks completed from arXiv:2402.16347 (read directly, not guessed)
- Reproduction target recorded: CodeS-1B on Spider dev = EX 77.9% / TS 72.2% (Table 5)
- Findings noted: CodeS reports EX/TS not EM for Spider; repo uses DeepSpeed ZeRO
  stage 2 while the paper states ZeRO-3 (repo-vs-paper mismatch)
- Section 8 reading log filled: per-section main claims + reproduction-focused doubts
- DELIVERABLES: Week 3 annotated-paper row marked done

Co-Authored-By: Claude Opus 4.8 <noreply@anthropic.com>
</commit_message>
<xml_diff>
--- a/docs/weekly-reports/Week 3/Paper_Annotation_Worksheet.docx
+++ b/docs/weekly-reports/Week 3/Paper_Annotation_Worksheet.docx
@@ -310,7 +310,7 @@
                 <w:sz w:val="19"/>
                 <w:szCs w:val="19"/>
               </w:rPr>
-              <w:t xml:space="preserve">Section / page where stated: ______</w:t>
+              <w:t xml:space="preserve">Section / page where stated: Section 1 (Introduction), pp. 1–2 — limitations L1 (unclear architectures), L2 (data-privacy risk), L3 (high inference cost) of closed-source LLMs such as GPT-4.</w:t>
             </w:r>
           </w:p>
         </w:tc>
@@ -382,7 +382,7 @@
                 <w:sz w:val="19"/>
                 <w:szCs w:val="19"/>
               </w:rPr>
-              <w:t xml:space="preserve">Exact input representation used: ______</w:t>
+              <w:t xml:space="preserve">Exact input representation used: the constructed “database prompt” (Section 6, Fig. 4): schema-filtered tables/columns + values matched by the value retriever (BM25 then LCS) + metadata (column types, comments, representative values, primary/foreign keys), then the question.</w:t>
             </w:r>
           </w:p>
         </w:tc>
@@ -454,7 +454,7 @@
                 <w:sz w:val="19"/>
                 <w:szCs w:val="19"/>
               </w:rPr>
-              <w:t xml:space="preserve">Post-processing applied, if any: ______</w:t>
+              <w:t xml:space="preserve">Post-processing applied, if any: beam search generates 4 candidate SQL queries and the first executable candidate is returned (Section 9.1.4, p. 10).</w:t>
             </w:r>
           </w:p>
         </w:tc>
@@ -526,7 +526,7 @@
                 <w:sz w:val="19"/>
                 <w:szCs w:val="19"/>
               </w:rPr>
-              <w:t xml:space="preserve">How is the prompt tokenised / truncated? ______</w:t>
+              <w:t xml:space="preserve">How is the prompt tokenised / truncated? kept within the max context length (8,192 tokens for 1B/3B/7B, 6,144 for 15B in pre-training; 4,096 for SFT); the schema filter prunes tables/columns so the prompt fits (Section 6.1).</w:t>
             </w:r>
           </w:p>
         </w:tc>
@@ -710,7 +710,7 @@
                 <w:sz w:val="19"/>
                 <w:szCs w:val="19"/>
               </w:rPr>
-              <w:t xml:space="preserve">Exact base checkpoint named: ______</w:t>
+              <w:t xml:space="preserve">Exact base checkpoint named: StarCoderBase-1B/3B/7B for CodeS-1B/3B/7B; CodeS-15B is built on StarCoder-15B (Section 5.2, p. 6). Therefore CodeS-1B is based on StarCoderBase-1B.</w:t>
             </w:r>
           </w:p>
         </w:tc>
@@ -782,7 +782,7 @@
                 <w:sz w:val="19"/>
                 <w:szCs w:val="19"/>
               </w:rPr>
-              <w:t xml:space="preserve">Which scale reports the headline result? ______</w:t>
+              <w:t xml:space="preserve">Which scale reports the headline result? on Spider dev (SFT, Table 5) CodeS-7B is highest (EX 85.4); CodeS-15B is framed as the overall leading model. Our reproduction targets CodeS-1B.</w:t>
             </w:r>
           </w:p>
         </w:tc>
@@ -854,7 +854,7 @@
                 <w:sz w:val="19"/>
                 <w:szCs w:val="19"/>
               </w:rPr>
-              <w:t xml:space="preserve">Corpus size / token count: ______</w:t>
+              <w:t xml:space="preserve">Corpus size / token count: 21.5 GB total = 11 GB SQL-related + 6 GB NL-to-code + 4.5 GB NL-related (Sections 4–5.1); trained 2 epochs on the SQL data and 1 epoch each on the other two.</w:t>
             </w:r>
           </w:p>
         </w:tc>
@@ -926,7 +926,7 @@
                 <w:sz w:val="19"/>
                 <w:szCs w:val="19"/>
               </w:rPr>
-              <w:t xml:space="preserve">Its architecture and size: ______</w:t>
+              <w:t xml:space="preserve">Its architecture and size: a “schema item classifier” — a compact neural network predicting table/column relevance scores, following RESDSQL [36]; keeps top-k1 tables and top-k2 columns (SFT: 6 and 10). Exact parameter count not stated; quality reported as AUC (Table 3).</w:t>
             </w:r>
           </w:p>
         </w:tc>
@@ -998,7 +998,7 @@
                 <w:sz w:val="19"/>
                 <w:szCs w:val="19"/>
               </w:rPr>
-              <w:t xml:space="preserve">How are matched values inserted into the prompt? ______</w:t>
+              <w:t xml:space="preserve">How are matched values inserted into the prompt? BM25 (Lucene/pyserini) coarse search then LCS fine matching; matched values are serialised and concatenated into the database prompt (Algorithm 1; e.g. “reviewer.name ( Sarah Martinez )” in Fig. 4).</w:t>
             </w:r>
           </w:p>
         </w:tc>
@@ -1070,7 +1070,7 @@
                 <w:sz w:val="19"/>
                 <w:szCs w:val="19"/>
               </w:rPr>
-              <w:t xml:space="preserve">What are the two directions? ______</w:t>
+              <w:t xml:space="preserve">What are the two directions? (1) question-to-SQL augmentation and (2) SQL-to-question augmentation, both using GPT-3.5 (Section 7; Figs. 3c and 5).</w:t>
             </w:r>
           </w:p>
         </w:tc>
@@ -1269,7 +1269,7 @@
                 <w:sz w:val="19"/>
                 <w:szCs w:val="19"/>
               </w:rPr>
-              <w:t xml:space="preserve">Equation no. ____   Form: ______________</w:t>
+              <w:t xml:space="preserve">Equation no. (2)   Form: p(x) = ∏(i=1..n−1) p(t_i | t_1,…,t_{i−1}) — the autoregressive language-modelling objective for incremental pre-training (Section 5.2).</w:t>
             </w:r>
           </w:p>
         </w:tc>
@@ -1341,7 +1341,7 @@
                 <w:sz w:val="19"/>
                 <w:szCs w:val="19"/>
               </w:rPr>
-              <w:t xml:space="preserve">Equation no. ____   Loss used: __________</w:t>
+              <w:t xml:space="preserve">Equation no.: none given — the schema item classifier has no numbered loss in the paper; trained as a relevance classifier following [36], reported via AUC (Table 3). (The SFT loss itself is Eq. (3): Loss = (1/h)·Σ p(d_i^sql | d_i^dbp, d_i^q).)</w:t>
             </w:r>
           </w:p>
         </w:tc>
@@ -1413,7 +1413,7 @@
                 <w:sz w:val="19"/>
                 <w:szCs w:val="19"/>
               </w:rPr>
-              <w:t xml:space="preserve">Equation no. ____   Scoring rule: ________</w:t>
+              <w:t xml:space="preserve">Equation no.: none — decoding is beam search producing 4 candidates; the first executable query is selected (Section 9.1.4).</w:t>
             </w:r>
           </w:p>
         </w:tc>
@@ -1485,7 +1485,7 @@
                 <w:sz w:val="19"/>
                 <w:szCs w:val="19"/>
               </w:rPr>
-              <w:t xml:space="preserve">Equation no. ____   Purpose: ____________</w:t>
+              <w:t xml:space="preserve">Equation no. (1) S = Parser(Q, D) — task definition (p. 4); Eq. (3) SFT loss (p. 8); Eq. (4) demonstration-retrieval similarity max(sentsim(t^q, d^q), sentsim(t^q, d^qs)) for few-shot (p. 8).</w:t>
             </w:r>
           </w:p>
         </w:tc>
@@ -1692,7 +1692,7 @@
                 <w:sz w:val="19"/>
                 <w:szCs w:val="19"/>
               </w:rPr>
-              <w:t xml:space="preserve">Paper value: ______</w:t>
+              <w:t xml:space="preserve">Paper value: AdamW (β1=0.9, β2=0.95, ε=1e−8), weight decay 0.1; pre-training LR 5e−5 with cosine decay (no warm-up) to 1/10 of initial; SFT LR 5e−6, cosine decay with linear warm-up over the first 5% (Sec. 5.2, 9.1.4).</w:t>
             </w:r>
           </w:p>
         </w:tc>
@@ -1764,7 +1764,7 @@
                 <w:sz w:val="19"/>
                 <w:szCs w:val="19"/>
               </w:rPr>
-              <w:t xml:space="preserve">Paper value: ______</w:t>
+              <w:t xml:space="preserve">Paper value: pre-training ≈ 4M tokens per step; SFT batch size 128 (matches the repo).</w:t>
             </w:r>
           </w:p>
         </w:tc>
@@ -1836,7 +1836,7 @@
                 <w:sz w:val="19"/>
                 <w:szCs w:val="19"/>
               </w:rPr>
-              <w:t xml:space="preserve">Paper value: ______</w:t>
+              <w:t xml:space="preserve">Paper value: BF16 mixed precision for pre-training; inference is deployable in float16. Matches the repo.</w:t>
             </w:r>
           </w:p>
         </w:tc>
@@ -1908,7 +1908,7 @@
                 <w:sz w:val="19"/>
                 <w:szCs w:val="19"/>
               </w:rPr>
-              <w:t xml:space="preserve">Paper value: ______</w:t>
+              <w:t xml:space="preserve">Paper value: DeepSpeed ZeRO-3 (Section 5.2). NOTE: the repo/accelerate config uses ZeRO stage 2 — a repo-vs-paper mismatch worth flagging.</w:t>
             </w:r>
           </w:p>
         </w:tc>
@@ -1980,7 +1980,7 @@
                 <w:sz w:val="19"/>
                 <w:szCs w:val="19"/>
               </w:rPr>
-              <w:t xml:space="preserve">Paper value: ______</w:t>
+              <w:t xml:space="preserve">Paper value: pre-training 2 epochs (SQL data) + 1 epoch each (NL, NL-to-code); SFT 4 epochs.</w:t>
             </w:r>
           </w:p>
         </w:tc>
@@ -2052,7 +2052,7 @@
                 <w:sz w:val="19"/>
                 <w:szCs w:val="19"/>
               </w:rPr>
-              <w:t xml:space="preserve">Paper value: ______</w:t>
+              <w:t xml:space="preserve">Paper value: pre-training 8,192 (1B/3B/7B), 6,144 (15B); SFT max context 4,096.</w:t>
             </w:r>
           </w:p>
         </w:tc>
@@ -2124,7 +2124,7 @@
                 <w:sz w:val="19"/>
                 <w:szCs w:val="19"/>
               </w:rPr>
-              <w:t xml:space="preserve">Paper value: ______</w:t>
+              <w:t xml:space="preserve">Paper value: beam-search width 4 (4 candidates; first executable chosen).</w:t>
             </w:r>
           </w:p>
         </w:tc>
@@ -2196,7 +2196,7 @@
                 <w:sz w:val="19"/>
                 <w:szCs w:val="19"/>
               </w:rPr>
-              <w:t xml:space="preserve">Paper value: ______</w:t>
+              <w:t xml:space="preserve">Paper value: 4,194,304 tokens (= 4M) per step — matches the repo exactly.</w:t>
             </w:r>
           </w:p>
         </w:tc>
@@ -2403,7 +2403,7 @@
                 <w:sz w:val="19"/>
                 <w:szCs w:val="19"/>
               </w:rPr>
-              <w:t xml:space="preserve">Which table reports Spider dev? ______</w:t>
+              <w:t xml:space="preserve">Which table reports Spider dev? Table 5 (SFT CodeS on Spider’s dev set); few-shot in-context results are in Table 4.</w:t>
             </w:r>
           </w:p>
         </w:tc>
@@ -2475,7 +2475,7 @@
                 <w:sz w:val="19"/>
                 <w:szCs w:val="19"/>
               </w:rPr>
-              <w:t xml:space="preserve">Which is the headline metric? ______</w:t>
+              <w:t xml:space="preserve">Which is the headline metric? Execution Accuracy (EX); the paper also reports Test-suite accuracy (TS). NOTE: CodeS does NOT report Exact-set Match (EM) for Spider — the “metrics” row above should be corrected to EX and TS.</w:t>
             </w:r>
           </w:p>
         </w:tc>
@@ -2547,7 +2547,7 @@
                 <w:sz w:val="19"/>
                 <w:szCs w:val="19"/>
               </w:rPr>
-              <w:t xml:space="preserve">EX: ______   EM: ______   (Table ___)</w:t>
+              <w:t xml:space="preserve">EX: 77.9   EM: not reported — the paper gives TS = 72.2 for Spider, not EM   (Table 5)</w:t>
             </w:r>
           </w:p>
         </w:tc>
@@ -2619,7 +2619,7 @@
                 <w:sz w:val="19"/>
                 <w:szCs w:val="19"/>
               </w:rPr>
-              <w:t xml:space="preserve">Scale: ______  EX: ______  EM: ______</w:t>
+              <w:t xml:space="preserve">Scale: CodeS-7B (highest on Spider dev)  EX: 85.4  TS: 80.3 (EM not reported). Overall leading model: CodeS-15B.</w:t>
             </w:r>
           </w:p>
         </w:tc>
@@ -2691,7 +2691,7 @@
                 <w:sz w:val="19"/>
                 <w:szCs w:val="19"/>
               </w:rPr>
-              <w:t xml:space="preserve">List: ______</w:t>
+              <w:t xml:space="preserve">List: fine-tuning — T5-3B+PICARD, RESDSQL-3B+NatSQL, Graphix-T5-3B+PICARD, SFT Llama2-7B/13B; prompting — GPT-4 (few-shot), C3+ChatGPT, Self-Debug+Codex, DIN-SQL+GPT-4, DAIL-SQL+GPT-4 (and +Self-Consistency), SQL-PaLM (Table 5).</w:t>
             </w:r>
           </w:p>
         </w:tc>
@@ -2763,7 +2763,7 @@
                 <w:sz w:val="19"/>
                 <w:szCs w:val="19"/>
               </w:rPr>
-              <w:t xml:space="preserve">Does the paper ablate it? Result: ______</w:t>
+              <w:t xml:space="preserve">Does the paper ablate it? Yes — Table 9 (3-shot ICL). Removing the schema filter lowers accuracy and slows generation (longer inputs): e.g. CodeS-1B Spider dev TS 57.4→55.0 (−2.4); larger drops on BIRD. Removing the value retriever also hurts, especially on BIRD.</w:t>
             </w:r>
           </w:p>
         </w:tc>
@@ -3113,7 +3113,7 @@
                 <w:sz w:val="19"/>
                 <w:szCs w:val="19"/>
               </w:rPr>
-              <w:t xml:space="preserve"/>
+              <w:t xml:space="preserve">Closed-source LLMs (GPT-4) dominate text-to-SQL but bring unclear architectures, data-privacy risk and high cost. Proposes CodeS — a fully open-source text-to-SQL LM family (1B–15B), 10–100× smaller yet matching or beating them. Three challenges: C1 give small models SQL reasoning via incremental pre-training; C2 schema linking via a schema filter + value retriever; C3 domain adaptation via bi-directional augmentation.</w:t>
             </w:r>
           </w:p>
         </w:tc>
@@ -3137,7 +3137,7 @@
                 <w:sz w:val="19"/>
                 <w:szCs w:val="19"/>
               </w:rPr>
-              <w:t xml:space="preserve"/>
+              <w:t xml:space="preserve">For our reproduction on one GPU: is the “10–100× smaller” advantage about parameter count only, or does the cost/latency benefit still hold on a T4? We only target CodeS-1B, not the SOTA 7B/15B.</w:t>
             </w:r>
           </w:p>
         </w:tc>
@@ -3186,7 +3186,7 @@
                 <w:sz w:val="19"/>
                 <w:szCs w:val="19"/>
               </w:rPr>
-              <w:t xml:space="preserve"/>
+              <w:t xml:space="preserve">Positions CodeS against two lines of work: SFT encoder-decoder models (RESDSQL, Graphix, PICARD) and prompting on GPT-4/PaLM (DIN-SQL, DAIL-SQL, C3). Reviews code LMs (StarCoder), schema-linking strategies and (question, SQL) data augmentation. CodeS reuses RESDSQL’s schema-filter idea but is itself a pre-trained generator, not an encoder add-on.</w:t>
             </w:r>
           </w:p>
         </w:tc>
@@ -3210,7 +3210,7 @@
                 <w:sz w:val="19"/>
                 <w:szCs w:val="19"/>
               </w:rPr>
-              <w:t xml:space="preserve"/>
+              <w:t xml:space="preserve">How much of CodeS’s gain is the StarCoder base vs. the schema filter borrowed from RESDSQL? If the filter is the swing factor, our Week-7 ablation should show it clearly.</w:t>
             </w:r>
           </w:p>
         </w:tc>
@@ -3259,7 +3259,7 @@
                 <w:sz w:val="19"/>
                 <w:szCs w:val="19"/>
               </w:rPr>
-              <w:t xml:space="preserve"/>
+              <w:t xml:space="preserve">Three components (Fig. 3): (a) incremental pre-training of StarCoder on a 21.5 GB SQL-centric corpus (Eq. 2 LM objective); (b) database-prompt construction = schema filter (top-k tables/columns) + value retriever (BM25 then LCS) + metadata (Algorithm 1); (c) bi-directional augmentation (question↔SQL via GPT-3.5). CodeS is then used via SFT (Eq. 3) or few-shot ICL with a demonstration retriever (Eq. 4).</w:t>
             </w:r>
           </w:p>
         </w:tc>
@@ -3283,7 +3283,7 @@
                 <w:sz w:val="19"/>
                 <w:szCs w:val="19"/>
               </w:rPr>
-              <w:t xml:space="preserve"/>
+              <w:t xml:space="preserve">Reproducing the database prompt needs the trained schema-item classifier (sic_ckpts) and a per-DB BM25 index — can we rebuild these or must we download the authors’ checkpoints? And how sensitive is output to prompt format (we already saw table order matters)?</w:t>
             </w:r>
           </w:p>
         </w:tc>
@@ -3332,7 +3332,7 @@
                 <w:sz w:val="19"/>
                 <w:szCs w:val="19"/>
               </w:rPr>
-              <w:t xml:space="preserve"/>
+              <w:t xml:space="preserve">Benchmarks: Spider (dev 1,034) + BIRD + four Spider variants + Dr.Spider. Metrics: EX and TS (test-suite) for the Spider family, EX/VES for BIRD. Hardware: 8× A800 80 GB, PyTorch 1.13.1, CentOS 7. SFT: 4 epochs, batch 128, LR 5e−6, context 4,096, top-k 6/10; inference = beam search with 4 candidates, first executable chosen.</w:t>
             </w:r>
           </w:p>
         </w:tc>
@@ -3356,7 +3356,7 @@
                 <w:sz w:val="19"/>
                 <w:szCs w:val="19"/>
               </w:rPr>
-              <w:t xml:space="preserve"/>
+              <w:t xml:space="preserve">The authors used 8× A800 80 GB — can CodeS-1B evaluation on Spider dev fit a single free Colab T4? A reduced batch size is likely, which we must log as a documented deviation.</w:t>
             </w:r>
           </w:p>
         </w:tc>
@@ -3405,7 +3405,7 @@
                 <w:sz w:val="19"/>
                 <w:szCs w:val="19"/>
               </w:rPr>
-              <w:t xml:space="preserve"/>
+              <w:t xml:space="preserve">SFT CodeS-7B and 15B set new SOTA on Spider’s dev set; SFT CodeS-3B already beats GPT-4-based DIN-SQL and DAIL-SQL (Table 5). CodeS-1B = EX 77.9 / TS 72.2. On BIRD, CodeS-15B tops the official leaderboard at submission time. Smaller models benefit most from the incremental pre-training.</w:t>
             </w:r>
           </w:p>
         </w:tc>
@@ -3429,7 +3429,7 @@
                 <w:sz w:val="19"/>
                 <w:szCs w:val="19"/>
               </w:rPr>
-              <w:t xml:space="preserve"/>
+              <w:t xml:space="preserve">Does the released seeklhy/codes-1b reproduce EX 77.9 out of the box, or is 77.9 the SFT-on-Spider checkpoint (so we must fine-tune or use their SFT weights)? Also, why is TS (72.2) noticeably below EX (77.9)?</w:t>
             </w:r>
           </w:p>
         </w:tc>
@@ -3478,7 +3478,7 @@
                 <w:sz w:val="19"/>
                 <w:szCs w:val="19"/>
               </w:rPr>
-              <w:t xml:space="preserve"/>
+              <w:t xml:space="preserve">Table 9 (3-shot ICL) ablates the components: removing the schema filter lowers accuracy and slows generation (longer inputs); removing the value retriever hurts, especially on BIRD; the demonstration retriever and metadata each contribute. Robust on Spider variants (Tables 7–8). Latency 0.6–1.5 s/query vs ~60 s for DIN-SQL+GPT-4; float16 memory 10/13/20/35 GB for 1B/3B/7B/15B.</w:t>
             </w:r>
           </w:p>
         </w:tc>
@@ -3502,7 +3502,7 @@
                 <w:sz w:val="19"/>
                 <w:szCs w:val="19"/>
               </w:rPr>
-              <w:t xml:space="preserve"/>
+              <w:t xml:space="preserve">The paper’s ablations are in the 3-shot ICL setting, not SFT — do the schema filter and value retriever help by the same margin under SFT, which is what we actually reproduce?</w:t>
             </w:r>
           </w:p>
         </w:tc>
@@ -3551,7 +3551,7 @@
                 <w:sz w:val="19"/>
                 <w:szCs w:val="19"/>
               </w:rPr>
-              <w:t xml:space="preserve"/>
+              <w:t xml:space="preserve">CodeS is a fully open-source, compact text-to-SQL LM family achieving new SOTA on nearly all benchmarks while remaining cheap and locally deployable. The code, models and the SQL-centric pre-training corpus are all released to enable further research.</w:t>
             </w:r>
           </w:p>
         </w:tc>
@@ -3575,7 +3575,7 @@
                 <w:sz w:val="19"/>
                 <w:szCs w:val="19"/>
               </w:rPr>
-              <w:t xml:space="preserve"/>
+              <w:t xml:space="preserve">The authors warn that newer transformers versions shift inference results slightly; with transformers 5.x on our stack, is a small EX gap acceptable as a documented cause rather than a reproduction failure?</w:t>
             </w:r>
           </w:p>
         </w:tc>

</xml_diff>